<commit_message>
Replace the QED course templates with real loop lessons, correct Lesson 60, and close the unfinished arc through running charge, Ward identities, infrared cancellation, and Schwinger's a=α/(2π).
Co-authored-by: Cursor <cursoragent@cursor.com>
</commit_message>
<xml_diff>
--- a/Science Books/QED Course/Lesson 44 The Electron-Photon Vertex.docx
+++ b/Science Books/QED Course/Lesson 44 The Electron-Photon Vertex.docx
@@ -452,8 +452,170 @@
       <m:oMathPara>
         <m:oMath>
           <m:r>
-            <m:t xml:space="preserve">i ∂_t |ψ(t)⟩_I = H_int,I(t) |ψ(t)⟩_I , qquad H_int,I(t) = e^(iH_0t) H_int e^(−iH_0t)</m:t>
+            <m:t xml:space="preserve">i</m:t>
           </m:r>
+          <m:sSub>
+            <m:e>
+              <m:r>
+                <m:t xml:space="preserve">∂</m:t>
+              </m:r>
+            </m:e>
+            <m:sub>
+              <m:r>
+                <m:t xml:space="preserve">t</m:t>
+              </m:r>
+            </m:sub>
+          </m:sSub>
+          <m:r>
+            <m:t xml:space="preserve">|</m:t>
+          </m:r>
+          <m:r>
+            <m:t xml:space="preserve">ψ</m:t>
+          </m:r>
+          <m:r>
+            <m:t xml:space="preserve">t</m:t>
+          </m:r>
+          <m:sSub>
+            <m:e>
+              <m:r>
+                <m:t xml:space="preserve">⟩</m:t>
+              </m:r>
+            </m:e>
+            <m:sub>
+              <m:r>
+                <m:t xml:space="preserve">I</m:t>
+              </m:r>
+            </m:sub>
+          </m:sSub>
+          <m:r>
+            <m:t xml:space="preserve">=</m:t>
+          </m:r>
+          <m:sSub>
+            <m:e>
+              <m:r>
+                <m:t xml:space="preserve">H</m:t>
+              </m:r>
+            </m:e>
+            <m:sub>
+              <m:r>
+                <m:t xml:space="preserve">int</m:t>
+              </m:r>
+            </m:sub>
+          </m:sSub>
+          <m:r>
+            <m:t xml:space="preserve">,</m:t>
+          </m:r>
+          <m:r>
+            <m:t xml:space="preserve">I</m:t>
+          </m:r>
+          <m:r>
+            <m:t xml:space="preserve">t</m:t>
+          </m:r>
+          <m:r>
+            <m:t xml:space="preserve">|</m:t>
+          </m:r>
+          <m:r>
+            <m:t xml:space="preserve">ψ</m:t>
+          </m:r>
+          <m:r>
+            <m:t xml:space="preserve">t</m:t>
+          </m:r>
+          <m:sSub>
+            <m:e>
+              <m:r>
+                <m:t xml:space="preserve">⟩</m:t>
+              </m:r>
+            </m:e>
+            <m:sub>
+              <m:r>
+                <m:t xml:space="preserve">I</m:t>
+              </m:r>
+            </m:sub>
+          </m:sSub>
+          <m:r>
+            <m:t xml:space="preserve">,</m:t>
+          </m:r>
+          <m:sSub>
+            <m:e>
+              <m:r>
+                <m:t xml:space="preserve">H</m:t>
+              </m:r>
+            </m:e>
+            <m:sub>
+              <m:r>
+                <m:t xml:space="preserve">int</m:t>
+              </m:r>
+            </m:sub>
+          </m:sSub>
+          <m:r>
+            <m:t xml:space="preserve">,</m:t>
+          </m:r>
+          <m:r>
+            <m:t xml:space="preserve">I</m:t>
+          </m:r>
+          <m:r>
+            <m:t xml:space="preserve">t</m:t>
+          </m:r>
+          <m:r>
+            <m:t xml:space="preserve">=</m:t>
+          </m:r>
+          <m:sSup>
+            <m:e>
+              <m:r>
+                <m:t xml:space="preserve">e</m:t>
+              </m:r>
+            </m:e>
+            <m:sup>
+              <m:sSub>
+                <m:e>
+                  <m:r>
+                    <m:t xml:space="preserve">iH</m:t>
+                  </m:r>
+                </m:e>
+                <m:sub>
+                  <m:r>
+                    <m:t xml:space="preserve">0t</m:t>
+                  </m:r>
+                </m:sub>
+              </m:sSub>
+            </m:sup>
+          </m:sSup>
+          <m:sSub>
+            <m:e>
+              <m:r>
+                <m:t xml:space="preserve">H</m:t>
+              </m:r>
+            </m:e>
+            <m:sub>
+              <m:r>
+                <m:t xml:space="preserve">int</m:t>
+              </m:r>
+            </m:sub>
+          </m:sSub>
+          <m:sSup>
+            <m:e>
+              <m:r>
+                <m:t xml:space="preserve">e</m:t>
+              </m:r>
+            </m:e>
+            <m:sup>
+              <m:r>
+                <m:t xml:space="preserve">−</m:t>
+              </m:r>
+              <m:sSub>
+                <m:e>
+                  <m:r>
+                    <m:t xml:space="preserve">iH</m:t>
+                  </m:r>
+                </m:e>
+                <m:sub>
+                  <m:r>
+                    <m:t xml:space="preserve">0t</m:t>
+                  </m:r>
+                </m:sub>
+              </m:sSub>
+            </m:sup>
+          </m:sSup>
         </m:oMath>
       </m:oMathPara>
     </w:p>
@@ -482,8 +644,105 @@
       </w:pPr>
       <m:oMathPara>
         <m:oMath>
+          <m:sSubSup>
+            <m:e>
+              <m:r>
+                <m:t xml:space="preserve">U</m:t>
+              </m:r>
+            </m:e>
+            <m:sub>
+              <m:r>
+                <m:t xml:space="preserve">I</m:t>
+              </m:r>
+            </m:sub>
+            <m:sup>
+              <m:r>
+                <m:t xml:space="preserve">1</m:t>
+              </m:r>
+            </m:sup>
+          </m:sSubSup>
           <m:r>
-            <m:t xml:space="preserve">U_I^((1))(t,t_0) = − i ∫_(t_0)^t dt′ H_int,I(t′)</m:t>
+            <m:t xml:space="preserve">t</m:t>
+          </m:r>
+          <m:r>
+            <m:t xml:space="preserve">,</m:t>
+          </m:r>
+          <m:sSub>
+            <m:e>
+              <m:r>
+                <m:t xml:space="preserve">t</m:t>
+              </m:r>
+            </m:e>
+            <m:sub>
+              <m:r>
+                <m:t xml:space="preserve">0</m:t>
+              </m:r>
+            </m:sub>
+          </m:sSub>
+          <m:r>
+            <m:t xml:space="preserve">=</m:t>
+          </m:r>
+          <m:r>
+            <m:t xml:space="preserve">−</m:t>
+          </m:r>
+          <m:r>
+            <m:t xml:space="preserve">i</m:t>
+          </m:r>
+          <m:sSubSup>
+            <m:e>
+              <m:r>
+                <m:t xml:space="preserve">∫</m:t>
+              </m:r>
+            </m:e>
+            <m:sub>
+              <m:sSub>
+                <m:e>
+                  <m:r>
+                    <m:t xml:space="preserve">t</m:t>
+                  </m:r>
+                </m:e>
+                <m:sub>
+                  <m:r>
+                    <m:t xml:space="preserve">0</m:t>
+                  </m:r>
+                </m:sub>
+              </m:sSub>
+            </m:sub>
+            <m:sup>
+              <m:r>
+                <m:t xml:space="preserve">t</m:t>
+              </m:r>
+            </m:sup>
+          </m:sSubSup>
+          <m:r>
+            <m:t xml:space="preserve">dt</m:t>
+          </m:r>
+          <m:r>
+            <m:t xml:space="preserve">′</m:t>
+          </m:r>
+          <m:sSub>
+            <m:e>
+              <m:r>
+                <m:t xml:space="preserve">H</m:t>
+              </m:r>
+            </m:e>
+            <m:sub>
+              <m:r>
+                <m:t xml:space="preserve">int</m:t>
+              </m:r>
+            </m:sub>
+          </m:sSub>
+          <m:r>
+            <m:t xml:space="preserve">,</m:t>
+          </m:r>
+          <m:r>
+            <m:t xml:space="preserve">I</m:t>
+          </m:r>
+          <m:r>
+            <m:t xml:space="preserve">t</m:t>
+          </m:r>
+          <m:r>
+            <m:t xml:space="preserve">′</m:t>
           </m:r>
         </m:oMath>
       </m:oMathPara>
@@ -500,8 +759,59 @@
       </w:pPr>
       <m:oMathPara>
         <m:oMath>
+          <m:sSup>
+            <m:e>
+              <m:r>
+                <m:t xml:space="preserve">S</m:t>
+              </m:r>
+            </m:e>
+            <m:sup>
+              <m:r>
+                <m:t xml:space="preserve">1</m:t>
+              </m:r>
+            </m:sup>
+          </m:sSup>
           <m:r>
-            <m:t xml:space="preserve">S^((1)) = − i ∫ d⁴x ℋ_int(x)</m:t>
+            <m:t xml:space="preserve">=</m:t>
+          </m:r>
+          <m:r>
+            <m:t xml:space="preserve">−</m:t>
+          </m:r>
+          <m:r>
+            <m:t xml:space="preserve">i</m:t>
+          </m:r>
+          <m:r>
+            <m:t xml:space="preserve">∫</m:t>
+          </m:r>
+          <m:sSup>
+            <m:e>
+              <m:r>
+                <m:t xml:space="preserve">d</m:t>
+              </m:r>
+            </m:e>
+            <m:sup>
+              <m:r>
+                <m:t xml:space="preserve">4</m:t>
+              </m:r>
+            </m:sup>
+          </m:sSup>
+          <m:r>
+            <m:t xml:space="preserve">x</m:t>
+          </m:r>
+          <m:sSub>
+            <m:e>
+              <m:r>
+                <m:t xml:space="preserve">ℋ</m:t>
+              </m:r>
+            </m:e>
+            <m:sub>
+              <m:r>
+                <m:t xml:space="preserve">int</m:t>
+              </m:r>
+            </m:sub>
+          </m:sSub>
+          <m:r>
+            <m:t xml:space="preserve">x</m:t>
           </m:r>
         </m:oMath>
       </m:oMathPara>
@@ -613,7 +923,217 @@
       <m:oMathPara>
         <m:oMath>
           <m:r>
-            <m:t xml:space="preserve">⟨p′,s′| S^((1)) |p,s;k,λ⟩ = ie ∫ d⁴x [ ū_s′(p′) e^(ip′x) ] γ^μ [ u_s(p) e^(−ipx) ] [ ε_λ,μ(k) e^(−ikx) ]</m:t>
+            <m:t xml:space="preserve">⟨p</m:t>
+          </m:r>
+          <m:r>
+            <m:t xml:space="preserve">′</m:t>
+          </m:r>
+          <m:r>
+            <m:t xml:space="preserve">,</m:t>
+          </m:r>
+          <m:r>
+            <m:t xml:space="preserve">s</m:t>
+          </m:r>
+          <m:r>
+            <m:t xml:space="preserve">′</m:t>
+          </m:r>
+          <m:r>
+            <m:t xml:space="preserve">|</m:t>
+          </m:r>
+          <m:sSup>
+            <m:e>
+              <m:r>
+                <m:t xml:space="preserve">S</m:t>
+              </m:r>
+            </m:e>
+            <m:sup>
+              <m:r>
+                <m:t xml:space="preserve">1</m:t>
+              </m:r>
+            </m:sup>
+          </m:sSup>
+          <m:r>
+            <m:t xml:space="preserve">|</m:t>
+          </m:r>
+          <m:r>
+            <m:t xml:space="preserve">p</m:t>
+          </m:r>
+          <m:r>
+            <m:t xml:space="preserve">,</m:t>
+          </m:r>
+          <m:r>
+            <m:t xml:space="preserve">s</m:t>
+          </m:r>
+          <m:r>
+            <m:t xml:space="preserve">;</m:t>
+          </m:r>
+          <m:r>
+            <m:t xml:space="preserve">k</m:t>
+          </m:r>
+          <m:r>
+            <m:t xml:space="preserve">,</m:t>
+          </m:r>
+          <m:r>
+            <m:t xml:space="preserve">λ⟩</m:t>
+          </m:r>
+          <m:r>
+            <m:t xml:space="preserve">=</m:t>
+          </m:r>
+          <m:r>
+            <m:t xml:space="preserve">ie</m:t>
+          </m:r>
+          <m:r>
+            <m:t xml:space="preserve">∫</m:t>
+          </m:r>
+          <m:sSup>
+            <m:e>
+              <m:r>
+                <m:t xml:space="preserve">d</m:t>
+              </m:r>
+            </m:e>
+            <m:sup>
+              <m:r>
+                <m:t xml:space="preserve">4</m:t>
+              </m:r>
+            </m:sup>
+          </m:sSup>
+          <m:r>
+            <m:t xml:space="preserve">x</m:t>
+          </m:r>
+          <m:r>
+            <m:t xml:space="preserve">[</m:t>
+          </m:r>
+          <m:sSub>
+            <m:e>
+              <m:r>
+                <m:t xml:space="preserve">ū</m:t>
+              </m:r>
+            </m:e>
+            <m:sub>
+              <m:r>
+                <m:t xml:space="preserve">s</m:t>
+              </m:r>
+            </m:sub>
+          </m:sSub>
+          <m:r>
+            <m:t xml:space="preserve">′</m:t>
+          </m:r>
+          <m:r>
+            <m:t xml:space="preserve">p</m:t>
+          </m:r>
+          <m:r>
+            <m:t xml:space="preserve">′</m:t>
+          </m:r>
+          <m:sSup>
+            <m:e>
+              <m:r>
+                <m:t xml:space="preserve">e</m:t>
+              </m:r>
+            </m:e>
+            <m:sup>
+              <m:r>
+                <m:t xml:space="preserve">ip</m:t>
+              </m:r>
+              <m:r>
+                <m:t xml:space="preserve">′</m:t>
+              </m:r>
+              <m:r>
+                <m:t xml:space="preserve">x</m:t>
+              </m:r>
+            </m:sup>
+          </m:sSup>
+          <m:r>
+            <m:t xml:space="preserve">]</m:t>
+          </m:r>
+          <m:sSup>
+            <m:e>
+              <m:r>
+                <m:t xml:space="preserve">γ</m:t>
+              </m:r>
+            </m:e>
+            <m:sup>
+              <m:r>
+                <m:t xml:space="preserve">μ</m:t>
+              </m:r>
+            </m:sup>
+          </m:sSup>
+          <m:r>
+            <m:t xml:space="preserve">[</m:t>
+          </m:r>
+          <m:sSub>
+            <m:e>
+              <m:r>
+                <m:t xml:space="preserve">u</m:t>
+              </m:r>
+            </m:e>
+            <m:sub>
+              <m:r>
+                <m:t xml:space="preserve">s</m:t>
+              </m:r>
+            </m:sub>
+          </m:sSub>
+          <m:r>
+            <m:t xml:space="preserve">p</m:t>
+          </m:r>
+          <m:sSup>
+            <m:e>
+              <m:r>
+                <m:t xml:space="preserve">e</m:t>
+              </m:r>
+            </m:e>
+            <m:sup>
+              <m:r>
+                <m:t xml:space="preserve">−</m:t>
+              </m:r>
+              <m:r>
+                <m:t xml:space="preserve">ipx</m:t>
+              </m:r>
+            </m:sup>
+          </m:sSup>
+          <m:r>
+            <m:t xml:space="preserve">]</m:t>
+          </m:r>
+          <m:r>
+            <m:t xml:space="preserve">[</m:t>
+          </m:r>
+          <m:sSub>
+            <m:e>
+              <m:r>
+                <m:t xml:space="preserve">ε</m:t>
+              </m:r>
+            </m:e>
+            <m:sub>
+              <m:r>
+                <m:t xml:space="preserve">λ</m:t>
+              </m:r>
+            </m:sub>
+          </m:sSub>
+          <m:r>
+            <m:t xml:space="preserve">,</m:t>
+          </m:r>
+          <m:r>
+            <m:t xml:space="preserve">μ</m:t>
+          </m:r>
+          <m:r>
+            <m:t xml:space="preserve">k</m:t>
+          </m:r>
+          <m:sSup>
+            <m:e>
+              <m:r>
+                <m:t xml:space="preserve">e</m:t>
+              </m:r>
+            </m:e>
+            <m:sup>
+              <m:r>
+                <m:t xml:space="preserve">−</m:t>
+              </m:r>
+              <m:r>
+                <m:t xml:space="preserve">ikx</m:t>
+              </m:r>
+            </m:sup>
+          </m:sSup>
+          <m:r>
+            <m:t xml:space="preserve">]</m:t>
           </m:r>
         </m:oMath>
       </m:oMathPara>
@@ -639,7 +1159,103 @@
       <m:oMathPara>
         <m:oMath>
           <m:r>
-            <m:t xml:space="preserve">∫ d⁴x , e^(i(p′−p−k)x) = (2π)⁴ δ⁴(p′−p−k)</m:t>
+            <m:t xml:space="preserve">∫</m:t>
+          </m:r>
+          <m:sSup>
+            <m:e>
+              <m:r>
+                <m:t xml:space="preserve">d</m:t>
+              </m:r>
+            </m:e>
+            <m:sup>
+              <m:r>
+                <m:t xml:space="preserve">4</m:t>
+              </m:r>
+            </m:sup>
+          </m:sSup>
+          <m:r>
+            <m:t xml:space="preserve">x</m:t>
+          </m:r>
+          <m:r>
+            <m:t xml:space="preserve">,</m:t>
+          </m:r>
+          <m:sSup>
+            <m:e>
+              <m:r>
+                <m:t xml:space="preserve">e</m:t>
+              </m:r>
+            </m:e>
+            <m:sup>
+              <m:r>
+                <m:t xml:space="preserve">i</m:t>
+              </m:r>
+              <m:r>
+                <m:t xml:space="preserve">p</m:t>
+              </m:r>
+              <m:r>
+                <m:t xml:space="preserve">′</m:t>
+              </m:r>
+              <m:r>
+                <m:t xml:space="preserve">−</m:t>
+              </m:r>
+              <m:r>
+                <m:t xml:space="preserve">p</m:t>
+              </m:r>
+              <m:r>
+                <m:t xml:space="preserve">−</m:t>
+              </m:r>
+              <m:r>
+                <m:t xml:space="preserve">k</m:t>
+              </m:r>
+              <m:r>
+                <m:t xml:space="preserve">x</m:t>
+              </m:r>
+            </m:sup>
+          </m:sSup>
+          <m:r>
+            <m:t xml:space="preserve">=</m:t>
+          </m:r>
+          <m:sSup>
+            <m:e>
+              <m:r>
+                <m:t xml:space="preserve">2π</m:t>
+              </m:r>
+            </m:e>
+            <m:sup>
+              <m:r>
+                <m:t xml:space="preserve">4</m:t>
+              </m:r>
+            </m:sup>
+          </m:sSup>
+          <m:sSup>
+            <m:e>
+              <m:r>
+                <m:t xml:space="preserve">δ</m:t>
+              </m:r>
+            </m:e>
+            <m:sup>
+              <m:r>
+                <m:t xml:space="preserve">4</m:t>
+              </m:r>
+            </m:sup>
+          </m:sSup>
+          <m:r>
+            <m:t xml:space="preserve">p</m:t>
+          </m:r>
+          <m:r>
+            <m:t xml:space="preserve">′</m:t>
+          </m:r>
+          <m:r>
+            <m:t xml:space="preserve">−</m:t>
+          </m:r>
+          <m:r>
+            <m:t xml:space="preserve">p</m:t>
+          </m:r>
+          <m:r>
+            <m:t xml:space="preserve">−</m:t>
+          </m:r>
+          <m:r>
+            <m:t xml:space="preserve">k</m:t>
           </m:r>
         </m:oMath>
       </m:oMathPara>
@@ -657,7 +1273,184 @@
       <m:oMathPara>
         <m:oMath>
           <m:r>
-            <m:t xml:space="preserve">⟨p′,s′| S^((1)) |p,s;k,λ⟩ = ie , ū_s′(p′) γ^μ u_s(p) , ε_λ,μ(k) , (2π)⁴δ⁴(p′−p−k)</m:t>
+            <m:t xml:space="preserve">⟨p</m:t>
+          </m:r>
+          <m:r>
+            <m:t xml:space="preserve">′</m:t>
+          </m:r>
+          <m:r>
+            <m:t xml:space="preserve">,</m:t>
+          </m:r>
+          <m:r>
+            <m:t xml:space="preserve">s</m:t>
+          </m:r>
+          <m:r>
+            <m:t xml:space="preserve">′</m:t>
+          </m:r>
+          <m:r>
+            <m:t xml:space="preserve">|</m:t>
+          </m:r>
+          <m:sSup>
+            <m:e>
+              <m:r>
+                <m:t xml:space="preserve">S</m:t>
+              </m:r>
+            </m:e>
+            <m:sup>
+              <m:r>
+                <m:t xml:space="preserve">1</m:t>
+              </m:r>
+            </m:sup>
+          </m:sSup>
+          <m:r>
+            <m:t xml:space="preserve">|</m:t>
+          </m:r>
+          <m:r>
+            <m:t xml:space="preserve">p</m:t>
+          </m:r>
+          <m:r>
+            <m:t xml:space="preserve">,</m:t>
+          </m:r>
+          <m:r>
+            <m:t xml:space="preserve">s</m:t>
+          </m:r>
+          <m:r>
+            <m:t xml:space="preserve">;</m:t>
+          </m:r>
+          <m:r>
+            <m:t xml:space="preserve">k</m:t>
+          </m:r>
+          <m:r>
+            <m:t xml:space="preserve">,</m:t>
+          </m:r>
+          <m:r>
+            <m:t xml:space="preserve">λ⟩</m:t>
+          </m:r>
+          <m:r>
+            <m:t xml:space="preserve">=</m:t>
+          </m:r>
+          <m:r>
+            <m:t xml:space="preserve">ie</m:t>
+          </m:r>
+          <m:r>
+            <m:t xml:space="preserve">,</m:t>
+          </m:r>
+          <m:sSub>
+            <m:e>
+              <m:r>
+                <m:t xml:space="preserve">ū</m:t>
+              </m:r>
+            </m:e>
+            <m:sub>
+              <m:r>
+                <m:t xml:space="preserve">s</m:t>
+              </m:r>
+            </m:sub>
+          </m:sSub>
+          <m:r>
+            <m:t xml:space="preserve">′</m:t>
+          </m:r>
+          <m:r>
+            <m:t xml:space="preserve">p</m:t>
+          </m:r>
+          <m:r>
+            <m:t xml:space="preserve">′</m:t>
+          </m:r>
+          <m:sSup>
+            <m:e>
+              <m:r>
+                <m:t xml:space="preserve">γ</m:t>
+              </m:r>
+            </m:e>
+            <m:sup>
+              <m:r>
+                <m:t xml:space="preserve">μ</m:t>
+              </m:r>
+            </m:sup>
+          </m:sSup>
+          <m:sSub>
+            <m:e>
+              <m:r>
+                <m:t xml:space="preserve">u</m:t>
+              </m:r>
+            </m:e>
+            <m:sub>
+              <m:r>
+                <m:t xml:space="preserve">s</m:t>
+              </m:r>
+            </m:sub>
+          </m:sSub>
+          <m:r>
+            <m:t xml:space="preserve">p</m:t>
+          </m:r>
+          <m:r>
+            <m:t xml:space="preserve">,</m:t>
+          </m:r>
+          <m:sSub>
+            <m:e>
+              <m:r>
+                <m:t xml:space="preserve">ε</m:t>
+              </m:r>
+            </m:e>
+            <m:sub>
+              <m:r>
+                <m:t xml:space="preserve">λ</m:t>
+              </m:r>
+            </m:sub>
+          </m:sSub>
+          <m:r>
+            <m:t xml:space="preserve">,</m:t>
+          </m:r>
+          <m:r>
+            <m:t xml:space="preserve">μ</m:t>
+          </m:r>
+          <m:r>
+            <m:t xml:space="preserve">k</m:t>
+          </m:r>
+          <m:r>
+            <m:t xml:space="preserve">,</m:t>
+          </m:r>
+          <m:sSup>
+            <m:e>
+              <m:r>
+                <m:t xml:space="preserve">2π</m:t>
+              </m:r>
+            </m:e>
+            <m:sup>
+              <m:r>
+                <m:t xml:space="preserve">4</m:t>
+              </m:r>
+            </m:sup>
+          </m:sSup>
+          <m:sSup>
+            <m:e>
+              <m:r>
+                <m:t xml:space="preserve">δ</m:t>
+              </m:r>
+            </m:e>
+            <m:sup>
+              <m:r>
+                <m:t xml:space="preserve">4</m:t>
+              </m:r>
+            </m:sup>
+          </m:sSup>
+          <m:r>
+            <m:t xml:space="preserve">p</m:t>
+          </m:r>
+          <m:r>
+            <m:t xml:space="preserve">′</m:t>
+          </m:r>
+          <m:r>
+            <m:t xml:space="preserve">−</m:t>
+          </m:r>
+          <m:r>
+            <m:t xml:space="preserve">p</m:t>
+          </m:r>
+          <m:r>
+            <m:t xml:space="preserve">−</m:t>
+          </m:r>
+          <m:r>
+            <m:t xml:space="preserve">k</m:t>
           </m:r>
         </m:oMath>
       </m:oMathPara>
@@ -668,6 +1461,43 @@
       </w:pPr>
       <w:r>
         <w:t>3.3 The vertex factor</w:t>
+      </w:r>
+    </w:p>
+    <w:p>
+      <w:pPr>
+        <w:spacing w:before="160" w:after="160"/>
+        <w:jc w:val="center"/>
+      </w:pPr>
+      <w:r>
+        <w:rPr>
+          <w:rFonts w:ascii="Consolas" w:hAnsi="Consolas" w:cs="Consolas" w:eastAsia="Consolas"/>
+          <w:sz w:val="20"/>
+        </w:rPr>
+        <w:t>e^{-}(p) ----*---- e^{-}(p')</w:t>
+      </w:r>
+      <w:r>
+        <w:rPr>
+          <w:rFonts w:ascii="Consolas" w:hAnsi="Consolas" w:cs="Consolas" w:eastAsia="Consolas"/>
+          <w:sz w:val="20"/>
+        </w:rPr>
+        <w:br/>
+        <w:t xml:space="preserve">             |</w:t>
+      </w:r>
+      <w:r>
+        <w:rPr>
+          <w:rFonts w:ascii="Consolas" w:hAnsi="Consolas" w:cs="Consolas" w:eastAsia="Consolas"/>
+          <w:sz w:val="20"/>
+        </w:rPr>
+        <w:br/>
+        <w:t xml:space="preserve">             |</w:t>
+      </w:r>
+      <w:r>
+        <w:rPr>
+          <w:rFonts w:ascii="Consolas" w:hAnsi="Consolas" w:cs="Consolas" w:eastAsia="Consolas"/>
+          <w:sz w:val="20"/>
+        </w:rPr>
+        <w:br/>
+        <w:t xml:space="preserve">            γ(k)</w:t>
       </w:r>
     </w:p>
     <w:p>
@@ -683,8 +1513,23 @@
       <m:oMathPara>
         <m:oMath>
           <m:r>
-            <m:t xml:space="preserve">i e γ^μ</m:t>
+            <m:t xml:space="preserve">i</m:t>
           </m:r>
+          <m:r>
+            <m:t xml:space="preserve">e</m:t>
+          </m:r>
+          <m:sSup>
+            <m:e>
+              <m:r>
+                <m:t xml:space="preserve">γ</m:t>
+              </m:r>
+            </m:e>
+            <m:sup>
+              <m:r>
+                <m:t xml:space="preserve">μ</m:t>
+              </m:r>
+            </m:sup>
+          </m:sSup>
         </m:oMath>
       </m:oMathPara>
     </w:p>
@@ -735,7 +1580,19 @@
       <m:oMathPara>
         <m:oMath>
           <m:r>
-            <m:t xml:space="preserve">p · k = 0</m:t>
+            <m:t xml:space="preserve">p</m:t>
+          </m:r>
+          <m:r>
+            <m:t xml:space="preserve">·</m:t>
+          </m:r>
+          <m:r>
+            <m:t xml:space="preserve">k</m:t>
+          </m:r>
+          <m:r>
+            <m:t xml:space="preserve">=</m:t>
+          </m:r>
+          <m:r>
+            <m:t xml:space="preserve">0</m:t>
           </m:r>
         </m:oMath>
       </m:oMathPara>
@@ -3569,14 +4426,15 @@
       <w:keepNext/>
       <w:keepLines/>
       <w:spacing w:before="280" w:after="140"/>
+      <w:jc w:val="center"/>
       <w:outlineLvl w:val="0"/>
     </w:pPr>
     <w:rPr>
-      <w:rFonts w:asciiTheme="majorHAnsi" w:eastAsiaTheme="majorEastAsia" w:hAnsiTheme="majorHAnsi" w:cstheme="majorBidi" w:ascii="Aptos Display" w:hAnsi="Aptos Display"/>
+      <w:rFonts w:asciiTheme="majorHAnsi" w:eastAsiaTheme="majorEastAsia" w:hAnsiTheme="majorHAnsi" w:cstheme="majorBidi" w:ascii="Amazon Ember" w:hAnsi="Amazon Ember" w:eastAsia="Amazon Ember" w:cs="Amazon Ember"/>
       <w:b/>
       <w:bCs/>
-      <w:color w:val="000000"/>
-      <w:sz w:val="40"/>
+      <w:color w:val="0000FF"/>
+      <w:sz w:val="36"/>
       <w:szCs w:val="28"/>
     </w:rPr>
   </w:style>
@@ -3593,14 +4451,15 @@
       <w:keepNext/>
       <w:keepLines/>
       <w:spacing w:before="280" w:after="140"/>
+      <w:jc w:val="center"/>
       <w:outlineLvl w:val="1"/>
     </w:pPr>
     <w:rPr>
-      <w:rFonts w:asciiTheme="majorHAnsi" w:eastAsiaTheme="majorEastAsia" w:hAnsiTheme="majorHAnsi" w:cstheme="majorBidi" w:ascii="Aptos Display" w:hAnsi="Aptos Display"/>
+      <w:rFonts w:asciiTheme="majorHAnsi" w:eastAsiaTheme="majorEastAsia" w:hAnsiTheme="majorHAnsi" w:cstheme="majorBidi" w:ascii="Amazon Ember" w:hAnsi="Amazon Ember" w:eastAsia="Amazon Ember" w:cs="Amazon Ember"/>
       <w:b/>
       <w:bCs/>
-      <w:color w:val="000000"/>
-      <w:sz w:val="30"/>
+      <w:color w:val="0000FF"/>
+      <w:sz w:val="32"/>
       <w:szCs w:val="26"/>
     </w:rPr>
   </w:style>
@@ -3617,14 +4476,15 @@
       <w:keepNext/>
       <w:keepLines/>
       <w:spacing w:before="280" w:after="140"/>
+      <w:jc w:val="center"/>
       <w:outlineLvl w:val="2"/>
     </w:pPr>
     <w:rPr>
-      <w:rFonts w:asciiTheme="majorHAnsi" w:eastAsiaTheme="majorEastAsia" w:hAnsiTheme="majorHAnsi" w:cstheme="majorBidi" w:ascii="Aptos Display" w:hAnsi="Aptos Display"/>
+      <w:rFonts w:asciiTheme="majorHAnsi" w:eastAsiaTheme="majorEastAsia" w:hAnsiTheme="majorHAnsi" w:cstheme="majorBidi" w:ascii="Amazon Ember" w:hAnsi="Amazon Ember" w:eastAsia="Amazon Ember" w:cs="Amazon Ember"/>
       <w:b/>
       <w:bCs/>
-      <w:color w:val="000000"/>
-      <w:sz w:val="24"/>
+      <w:color w:val="0000FF"/>
+      <w:sz w:val="28"/>
     </w:rPr>
   </w:style>
   <w:style w:type="paragraph" w:styleId="Heading4">
@@ -3860,11 +4720,12 @@
       </w:pBdr>
       <w:spacing w:after="140" w:line="240" w:lineRule="auto" w:before="0"/>
       <w:contextualSpacing/>
+      <w:jc w:val="center"/>
     </w:pPr>
     <w:rPr>
-      <w:rFonts w:asciiTheme="majorHAnsi" w:eastAsiaTheme="majorEastAsia" w:hAnsiTheme="majorHAnsi" w:cstheme="majorBidi" w:ascii="Aptos Display" w:hAnsi="Aptos Display"/>
+      <w:rFonts w:asciiTheme="majorHAnsi" w:eastAsiaTheme="majorEastAsia" w:hAnsiTheme="majorHAnsi" w:cstheme="majorBidi" w:ascii="Amazon Ember" w:hAnsi="Amazon Ember" w:eastAsia="Amazon Ember" w:cs="Amazon Ember"/>
       <w:b/>
-      <w:color w:val="000000"/>
+      <w:color w:val="0000FF"/>
       <w:spacing w:val="5"/>
       <w:kern w:val="28"/>
       <w:sz w:val="60"/>
@@ -3899,13 +4760,14 @@
         <w:ilvl w:val="1"/>
       </w:numPr>
       <w:spacing w:before="280" w:after="140"/>
+      <w:jc w:val="center"/>
     </w:pPr>
     <w:rPr>
-      <w:rFonts w:asciiTheme="majorHAnsi" w:eastAsiaTheme="majorEastAsia" w:hAnsiTheme="majorHAnsi" w:cstheme="majorBidi" w:ascii="Aptos Display" w:hAnsi="Aptos Display"/>
-      <w:b w:val="0"/>
+      <w:rFonts w:asciiTheme="majorHAnsi" w:eastAsiaTheme="majorEastAsia" w:hAnsiTheme="majorHAnsi" w:cstheme="majorBidi" w:ascii="Amazon Ember" w:hAnsi="Amazon Ember" w:eastAsia="Amazon Ember" w:cs="Amazon Ember"/>
+      <w:b/>
       <w:i/>
       <w:iCs/>
-      <w:color w:val="000000"/>
+      <w:color w:val="0000FF"/>
       <w:spacing w:val="15"/>
       <w:sz w:val="28"/>
       <w:szCs w:val="24"/>

</xml_diff>